<commit_message>
Deploy updated WNY HQT2 site
</commit_message>
<xml_diff>
--- a/template_command_large.docx
+++ b/template_command_large.docx
@@ -238,7 +238,7 @@
     </w:p>
     <w:p>
       <w:pPr>
-        <w:ind w:rightChars="117" w:right="281"/>
+        <w:ind w:rightChars="177" w:right="425"/>
         <w:jc w:val="both"/>
         <w:rPr>
           <w:rFonts w:ascii="TH SarabunPSK" w:hAnsi="TH SarabunPSK" w:cs="TH SarabunPSK"/>
@@ -252,6 +252,7 @@
           <w:rFonts w:ascii="TH SarabunPSK" w:hAnsi="TH SarabunPSK" w:cs="TH SarabunPSK"/>
           <w:sz w:val="32"/>
           <w:szCs w:val="32"/>
+          <w:cs/>
           <w:lang w:val="en-US"/>
         </w:rPr>
         <w:tab/>
@@ -261,6 +262,7 @@
           <w:rFonts w:ascii="TH SarabunPSK" w:hAnsi="TH SarabunPSK" w:cs="TH SarabunPSK"/>
           <w:sz w:val="32"/>
           <w:szCs w:val="32"/>
+          <w:cs/>
           <w:lang w:val="en-US"/>
         </w:rPr>
         <w:tab/>
@@ -273,7 +275,36 @@
           <w:cs/>
           <w:lang w:val="en-US"/>
         </w:rPr>
-        <w:t>ด้วยข้าราชการครูและบุคลากรทางการศึกษาโรงเรียนวังน้ำเย็นวิทยาคมมีความประสงค์จะเดินทางไปราชการ</w:t>
+        <w:t>ด้วยข้าราชการครูและบุคลากรทางการศึกษาโรงเรียนวังน้ำเย็นวิทยาคมมีความประสงค์จ</w:t>
+      </w:r>
+      <w:r>
+        <w:rPr>
+          <w:rFonts w:ascii="TH SarabunPSK" w:hAnsi="TH SarabunPSK" w:cs="TH SarabunPSK" w:hint="cs"/>
+          <w:sz w:val="32"/>
+          <w:szCs w:val="32"/>
+          <w:cs/>
+          <w:lang w:val="en-US"/>
+        </w:rPr>
+        <w:t>ะ</w:t>
+      </w:r>
+      <w:r>
+        <w:rPr>
+          <w:rFonts w:ascii="TH SarabunPSK" w:hAnsi="TH SarabunPSK" w:cs="TH SarabunPSK"/>
+          <w:sz w:val="32"/>
+          <w:szCs w:val="32"/>
+          <w:cs/>
+          <w:lang w:val="en-US"/>
+        </w:rPr>
+        <w:t>เดินทางไปราชการ เพื่อ</w:t>
+      </w:r>
+      <w:r>
+        <w:rPr>
+          <w:rFonts w:ascii="TH SarabunPSK" w:hAnsi="TH SarabunPSK" w:cs="TH SarabunPSK"/>
+          <w:sz w:val="32"/>
+          <w:szCs w:val="32"/>
+          <w:lang w:val="en-US"/>
+        </w:rPr>
+        <w:t xml:space="preserve">{purpose} {date_range} </w:t>
       </w:r>
       <w:r>
         <w:rPr>
@@ -292,35 +323,70 @@
           <w:cs/>
           <w:lang w:val="en-US"/>
         </w:rPr>
-        <w:t>เพื่อ</w:t>
-      </w:r>
-      <w:r>
-        <w:rPr>
-          <w:rFonts w:ascii="TH SarabunPSK" w:hAnsi="TH SarabunPSK" w:cs="TH SarabunPSK"/>
-          <w:sz w:val="32"/>
-          <w:szCs w:val="32"/>
-          <w:lang w:val="en-US"/>
-        </w:rPr>
-        <w:t xml:space="preserve">{purpose} {date_range} </w:t>
-      </w:r>
-      <w:r>
-        <w:rPr>
-          <w:rFonts w:ascii="TH SarabunPSK" w:hAnsi="TH SarabunPSK" w:cs="TH SarabunPSK"/>
-          <w:sz w:val="32"/>
-          <w:szCs w:val="32"/>
-          <w:cs/>
-          <w:lang w:val="en-US"/>
-        </w:rPr>
-        <w:t xml:space="preserve">ณ </w:t>
-      </w:r>
-      <w:r>
-        <w:rPr>
-          <w:rFonts w:ascii="TH SarabunPSK" w:hAnsi="TH SarabunPSK" w:cs="TH SarabunPSK"/>
-          <w:sz w:val="32"/>
-          <w:szCs w:val="32"/>
-          <w:lang w:val="en-US"/>
-        </w:rPr>
-        <w:t xml:space="preserve">{location} </w:t>
+        <w:t>ณ</w:t>
+      </w:r>
+      <w:r>
+        <w:rPr>
+          <w:rFonts w:ascii="TH SarabunPSK" w:hAnsi="TH SarabunPSK" w:cs="TH SarabunPSK"/>
+          <w:sz w:val="32"/>
+          <w:szCs w:val="32"/>
+          <w:lang w:val="en-US"/>
+        </w:rPr>
+        <w:t> </w:t>
+      </w:r>
+      <w:r>
+        <w:rPr>
+          <w:rFonts w:ascii="TH SarabunPSK" w:hAnsi="TH SarabunPSK" w:cs="TH SarabunPSK"/>
+          <w:sz w:val="32"/>
+          <w:szCs w:val="32"/>
+          <w:lang w:val="en-US"/>
+        </w:rPr>
+        <w:t>{location}</w:t>
+      </w:r>
+      <w:r>
+        <w:rPr>
+          <w:rFonts w:ascii="TH SarabunPSK" w:hAnsi="TH SarabunPSK" w:cs="TH SarabunPSK"/>
+          <w:sz w:val="32"/>
+          <w:szCs w:val="32"/>
+          <w:lang w:val="en-US"/>
+        </w:rPr>
+        <w:t xml:space="preserve"> </w:t>
+      </w:r>
+      <w:r>
+        <w:rPr>
+          <w:rFonts w:ascii="TH SarabunPSK" w:eastAsia="Sarabun" w:hAnsi="TH SarabunPSK" w:cs="TH SarabunPSK"/>
+          <w:sz w:val="32"/>
+          <w:szCs w:val="32"/>
+          <w:lang w:val="en-US"/>
+        </w:rPr>
+        <w:t>{</w:t>
+      </w:r>
+      <w:r>
+        <w:rPr>
+          <w:rFonts w:ascii="TH SarabunPSK" w:eastAsia="Sarabun" w:hAnsi="TH SarabunPSK" w:cs="TH SarabunPSK"/>
+          <w:sz w:val="32"/>
+          <w:szCs w:val="32"/>
+          <w:lang w:val="en-US"/>
+        </w:rPr>
+        <w:t>province</w:t>
+      </w:r>
+      <w:r>
+        <w:rPr>
+          <w:rFonts w:ascii="TH SarabunPSK" w:eastAsia="Sarabun" w:hAnsi="TH SarabunPSK" w:cs="TH SarabunPSK"/>
+          <w:sz w:val="32"/>
+          <w:szCs w:val="32"/>
+          <w:lang w:val="en-US"/>
+        </w:rPr>
+        <w:t>}</w:t>
+      </w:r>
+      <w:r>
+        <w:rPr>
+          <w:rFonts w:ascii="TH SarabunPSK" w:hAnsi="TH SarabunPSK" w:cs="TH SarabunPSK"/>
+          <w:sz w:val="32"/>
+          <w:szCs w:val="32"/>
+          <w:lang w:val="en-US"/>
+        </w:rPr>
+        <w:t xml:space="preserve"> </w:t>
       </w:r>
       <w:r>
         <w:rPr>
@@ -843,27 +909,7 @@
                 <w:szCs w:val="32"/>
                 <w:lang w:val="en-US"/>
               </w:rPr>
-              <w:t>{</w:t>
-            </w:r>
-            <w:proofErr w:type="spellStart"/>
-            <w:r>
-              <w:rPr>
-                <w:rFonts w:ascii="TH SarabunPSK" w:hAnsi="TH SarabunPSK" w:cs="TH SarabunPSK"/>
-                <w:sz w:val="32"/>
-                <w:szCs w:val="32"/>
-                <w:lang w:val="en-US"/>
-              </w:rPr>
-              <w:t>date_range</w:t>
-            </w:r>
-            <w:proofErr w:type="spellEnd"/>
-            <w:r>
-              <w:rPr>
-                <w:rFonts w:ascii="TH SarabunPSK" w:hAnsi="TH SarabunPSK" w:cs="TH SarabunPSK"/>
-                <w:sz w:val="32"/>
-                <w:szCs w:val="32"/>
-                <w:lang w:val="en-US"/>
-              </w:rPr>
-              <w:t>}</w:t>
+              <w:t>{date_range}</w:t>
             </w:r>
           </w:p>
           <w:p>
@@ -895,6 +941,42 @@
                 <w:lang w:val="en-US"/>
               </w:rPr>
               <w:t>{location}</w:t>
+            </w:r>
+            <w:r>
+              <w:rPr>
+                <w:rFonts w:ascii="TH SarabunPSK" w:hAnsi="TH SarabunPSK" w:cs="TH SarabunPSK"/>
+                <w:sz w:val="32"/>
+                <w:szCs w:val="32"/>
+                <w:lang w:val="en-US"/>
+              </w:rPr>
+              <w:t xml:space="preserve"> </w:t>
+            </w:r>
+            <w:r>
+              <w:rPr>
+                <w:rFonts w:ascii="TH SarabunPSK" w:eastAsia="Sarabun" w:hAnsi="TH SarabunPSK" w:cs="TH SarabunPSK"/>
+                <w:sz w:val="32"/>
+                <w:szCs w:val="32"/>
+                <w:lang w:val="en-US"/>
+              </w:rPr>
+              <w:t>{</w:t>
+            </w:r>
+            <w:r>
+              <w:rPr>
+                <w:rFonts w:ascii="TH SarabunPSK" w:eastAsia="Sarabun" w:hAnsi="TH SarabunPSK" w:cs="TH SarabunPSK"/>
+                <w:sz w:val="32"/>
+                <w:szCs w:val="32"/>
+                <w:lang w:val="en-US"/>
+              </w:rPr>
+              <w:t>province</w:t>
+            </w:r>
+            <w:r>
+              <w:rPr>
+                <w:rFonts w:ascii="TH SarabunPSK" w:eastAsia="Sarabun" w:hAnsi="TH SarabunPSK" w:cs="TH SarabunPSK"/>
+                <w:sz w:val="32"/>
+                <w:szCs w:val="32"/>
+                <w:lang w:val="en-US"/>
+              </w:rPr>
+              <w:t>}</w:t>
             </w:r>
           </w:p>
           <w:p>

</xml_diff>